<commit_message>
Disclose the stopped open-model 16-wording run (limitations, appendix D)
Co-Authored-By: Claude Sonnet 5.5 <noreply@anthropic.com>
Claude-Session: https://claude.ai/code/session_013HycsBHnRQDCEHKmLM3Rd4
</commit_message>
<xml_diff>
--- a/loss_chasing/isr/ISR_online_appendix_v2.docx
+++ b/loss_chasing/isr/ISR_online_appendix_v2.docx
@@ -3069,6 +3069,30 @@
           <w:szCs w:val="24"/>
         </w:rPr>
         <w:t xml:space="preserve"> After Study 1 we ran a time-pressure pilot with the registered headlines (three turns left, zero and three failures, 50 episodes per cell, the two open models and Haiku 4.5) and a check with four hand-written paraphrases per frame. In the Haiku pilot, the neutral frame skipped in 40 of 50 first choices and the other frames in few. We then replaced the hand-written paraphrases, which we had written after seeing the pilot output, with the 16 independently generated wordings of Study 2. The Haiku pilot and the four-paraphrase check are superseded by Studies 2 to 4 and are not reported as results; the open-model part of the time-pressure pilot is the only evidence on open models under time pressure and is reported in Study 2 as a pilot. Study 3 (thinking) and Study 4 (goal visibility and valence) were designed after Study 2, and Study 5 (expected values shown) after Study 4. The analysis scripts for Studies 2 to 5 were committed before the runs they analyze. Studies 2 to 5 are not registered.</w:t>
+      </w:r>
+    </w:p>
+    <w:p>
+      <w:pPr>
+        <w:spacing w:after="0" w:before="0" w:line="480"/>
+        <w:jc w:val="left"/>
+      </w:pPr>
+      <w:r>
+        <w:rPr>
+          <w:rFonts w:ascii="Times New Roman" w:cs="Times New Roman" w:eastAsia="Times New Roman" w:hAnsi="Times New Roman"/>
+          <w:b/>
+          <w:bCs/>
+          <w:sz w:val="24"/>
+          <w:szCs w:val="24"/>
+        </w:rPr>
+        <w:t xml:space="preserve">Stopped run.</w:t>
+      </w:r>
+      <w:r>
+        <w:rPr>
+          <w:rFonts w:ascii="Times New Roman" w:cs="Times New Roman" w:eastAsia="Times New Roman" w:hAnsi="Times New Roman"/>
+          <w:sz w:val="24"/>
+          <w:szCs w:val="24"/>
+        </w:rPr>
+        <w:t xml:space="preserve"> The 16-wording design (three frames, 16 wordings, 30 episodes, 12, 6 and 3 turns left) was started on Qwen2.5-1.5B-Instruct and SmolLM2-1.7B-Instruct on a local processor. The run was interrupted repeatedly and reached 966 of 1,440 first choices for Qwen2.5-1.5B-Instruct and none for SmolLM2-1.7B-Instruct. We stopped it because of the time it required, without analyzing the partial output, and we do not report it.</w:t>
       </w:r>
     </w:p>
     <w:p>

</xml_diff>